<commit_message>
provenance: AP44 LOCKED (FINAL v1.0, PROV-CCC.6-7, corrected unblinding key)
Lock landed at composite 9.3. Anchors the locked proof
(AP44_The_Snap_FINAL_v1_0.docx, d7626745…f9e6e828), superseded drafts
v0.2/v0.3/v0.6–v0.9, WP-CCC.1 rev 1.4, PROV-CCC.6 and the lock instrument
PROV-CCC.7, and the corrected unblinding key UNBLINDING_KEY_KS-CCC4_1.md
(7482445b…) with the first issue retained. Escrow remains private.

Registry line in AJ_LOCK_INSTRUCTIONS §3 is superseded by the Blink & Cost
lock note: Phase B publishes MKSR v5.27 · 568 · 44, not v5.26/567.
PROV-CCC.8 will carry the totals erratum. Tier 2 table at d8929cf
byte-untouched. Sidecar basename quirk on the corrected key noted, not
silently repaired.
</commit_message>
<xml_diff>
--- a/appendix-c/WP_CCC1_AppendixC_Tier1.docx
+++ b/appendix-c/WP_CCC1_AppendixC_Tier1.docx
@@ -161,7 +161,7 @@
           <w:sz w:val="16"/>
           <w:szCs w:val="16"/>
         </w:rPr>
-        <w:t xml:space="preserve">Rev 1.3 — integrates the same-day parallel execution (§4.6): the sign test, the uncertainty-model dependence, and the F-invariance limit binding Tier 2. Rev 1.1–1.2 corrections retained.</w:t>
+        <w:t xml:space="preserve">Rev 1.4 — the strain factor stated exact (27.4; 12.6 against the outer bound), per the author’s correction to the unblinding key; seventeen-point Birge 3.53 noted. Rev 1.1–1.3 retained.</w:t>
       </w:r>
     </w:p>
     <w:p>
@@ -3511,7 +3511,7 @@
           <w:sz w:val="21"/>
           <w:szCs w:val="21"/>
         </w:rPr>
-        <w:t xml:space="preserve">28</w:t>
+        <w:t xml:space="preserve">27.4</w:t>
       </w:r>
       <w:r>
         <w:rPr>
@@ -3529,7 +3529,7 @@
           <w:sz w:val="21"/>
           <w:szCs w:val="21"/>
         </w:rPr>
-        <w:t xml:space="preserve">13</w:t>
+        <w:t xml:space="preserve">12.6</w:t>
       </w:r>
       <w:r>
         <w:rPr>
@@ -3847,7 +3847,7 @@
           <w:sz w:val="21"/>
           <w:szCs w:val="21"/>
         </w:rPr>
-        <w:t xml:space="preserve"> For apparatus leakage to carry the 0.69%, an effect AP06 defines as boundary-geometry-dependent must be ≥93% independent of boundary geometry; free-falling atoms with no absorbing boundary must leak within a few per cent of a sealed cryogenic fibre; and the same-apparatus replication that bounds site-and-team effects at 254 ppm must be wrong by a factor of 28. The remaining escape is a leakage mechanism common to all boundaries — which is by definition not apparatus leakage but a universal term, i.e., Candidate 3’s anatomy under Candidate 1’s name. Tier 1 cannot formally close Candidate 1 (Tier 2’s blind coding could in principle reveal a hidden common geometric factor), but the burden has moved decisively.</w:t>
+        <w:t xml:space="preserve"> For apparatus leakage to carry the 0.69%, an effect AP06 defines as boundary-geometry-dependent must be ≥93% independent of boundary geometry; free-falling atoms with no absorbing boundary must leak within a few per cent of a sealed cryogenic fibre; and the same-apparatus replication that bounds site-and-team effects at 254 ppm must be wrong by a factor of 27.4. The remaining escape is a leakage mechanism common to all boundaries — which is by definition not apparatus leakage but a universal term, i.e., Candidate 3’s anatomy under Candidate 1’s name. Tier 1 cannot formally close Candidate 1 (Tier 2’s blind coding could in principle reveal a hidden common geometric factor), but the burden has moved decisively.</w:t>
       </w:r>
     </w:p>
     <w:p>
@@ -4190,7 +4190,7 @@
           <w:sz w:val="19"/>
           <w:szCs w:val="19"/>
         </w:rPr>
-        <w:t xml:space="preserve">End of WP-CCC.1, rev 1.3 — Tier 1 executed twice. Tier 2 pre-registered above.</w:t>
+        <w:t xml:space="preserve">End of WP-CCC.1, rev 1.4 — Tier 1 executed twice. Tier 2 pre-registered above.</w:t>
       </w:r>
     </w:p>
     <w:sectPr>

</xml_diff>